<commit_message>
Spazio prima delle immagini in tutte le guide; aggiunte convenzioni in CLAUDE.md
Co-Authored-By: Claude Opus 5.5 <noreply@anthropic.com>
Claude-Session: https://claude.ai/code/session_017FNXRGi3qa62SAS8zgzmg1
</commit_message>
<xml_diff>
--- a/Procedure/Guida_PalCompose.docx
+++ b/Procedure/Guida_PalCompose.docx
@@ -265,7 +265,7 @@
     <w:p>
       <w:pPr>
         <w:keepNext/>
-        <w:spacing w:after="80"/>
+        <w:spacing w:after="80" w:before="240"/>
         <w:jc w:val="center"/>
       </w:pPr>
       <w:r>
@@ -409,7 +409,7 @@
     <w:p>
       <w:pPr>
         <w:keepNext/>
-        <w:spacing w:after="80"/>
+        <w:spacing w:after="80" w:before="240"/>
         <w:jc w:val="center"/>
       </w:pPr>
       <w:r>
@@ -484,7 +484,7 @@
     <w:p>
       <w:pPr>
         <w:keepNext/>
-        <w:spacing w:after="80"/>
+        <w:spacing w:after="80" w:before="240"/>
         <w:jc w:val="center"/>
       </w:pPr>
       <w:r>
@@ -604,7 +604,7 @@
     <w:p>
       <w:pPr>
         <w:keepNext/>
-        <w:spacing w:after="80"/>
+        <w:spacing w:after="80" w:before="240"/>
         <w:jc w:val="center"/>
       </w:pPr>
       <w:r>
@@ -670,7 +670,7 @@
     <w:p>
       <w:pPr>
         <w:keepNext/>
-        <w:spacing w:after="80"/>
+        <w:spacing w:after="80" w:before="240"/>
         <w:jc w:val="center"/>
       </w:pPr>
       <w:r>
@@ -719,7 +719,7 @@
     <w:p>
       <w:pPr>
         <w:keepNext/>
-        <w:spacing w:after="80"/>
+        <w:spacing w:after="80" w:before="240"/>
         <w:jc w:val="center"/>
       </w:pPr>
       <w:r>
@@ -760,7 +760,7 @@
     <w:p>
       <w:pPr>
         <w:keepNext/>
-        <w:spacing w:after="80"/>
+        <w:spacing w:after="80" w:before="240"/>
         <w:jc w:val="center"/>
       </w:pPr>
       <w:r>
@@ -801,7 +801,7 @@
     <w:p>
       <w:pPr>
         <w:keepNext/>
-        <w:spacing w:after="80"/>
+        <w:spacing w:after="80" w:before="240"/>
         <w:jc w:val="center"/>
       </w:pPr>
       <w:r>
@@ -961,7 +961,7 @@
     <w:p>
       <w:pPr>
         <w:keepNext/>
-        <w:spacing w:after="80"/>
+        <w:spacing w:after="80" w:before="240"/>
         <w:jc w:val="center"/>
       </w:pPr>
       <w:r>
@@ -1030,7 +1030,7 @@
     <w:p>
       <w:pPr>
         <w:keepNext/>
-        <w:spacing w:after="80"/>
+        <w:spacing w:after="80" w:before="240"/>
         <w:jc w:val="center"/>
       </w:pPr>
       <w:r>
@@ -1200,7 +1200,7 @@
     <w:p>
       <w:pPr>
         <w:keepNext/>
-        <w:spacing w:after="80"/>
+        <w:spacing w:after="80" w:before="240"/>
         <w:jc w:val="center"/>
       </w:pPr>
       <w:r>
@@ -1241,7 +1241,7 @@
     <w:p>
       <w:pPr>
         <w:keepNext/>
-        <w:spacing w:after="80"/>
+        <w:spacing w:after="80" w:before="240"/>
         <w:jc w:val="center"/>
       </w:pPr>
       <w:r>
@@ -1282,7 +1282,7 @@
     <w:p>
       <w:pPr>
         <w:keepNext/>
-        <w:spacing w:after="80"/>
+        <w:spacing w:after="80" w:before="240"/>
         <w:jc w:val="center"/>
       </w:pPr>
       <w:r>
@@ -1323,7 +1323,7 @@
     <w:p>
       <w:pPr>
         <w:keepNext/>
-        <w:spacing w:after="80"/>
+        <w:spacing w:after="80" w:before="240"/>
         <w:jc w:val="center"/>
       </w:pPr>
       <w:r>
@@ -1376,7 +1376,7 @@
     <w:p>
       <w:pPr>
         <w:keepNext/>
-        <w:spacing w:after="80"/>
+        <w:spacing w:after="80" w:before="240"/>
         <w:jc w:val="center"/>
       </w:pPr>
       <w:r>
@@ -1417,7 +1417,7 @@
     <w:p>
       <w:pPr>
         <w:keepNext/>
-        <w:spacing w:after="80"/>
+        <w:spacing w:after="80" w:before="240"/>
         <w:jc w:val="center"/>
       </w:pPr>
       <w:r>
@@ -1458,7 +1458,7 @@
     <w:p>
       <w:pPr>
         <w:keepNext/>
-        <w:spacing w:after="80"/>
+        <w:spacing w:after="80" w:before="240"/>
         <w:jc w:val="center"/>
       </w:pPr>
       <w:r>
@@ -1513,7 +1513,7 @@
     <w:p>
       <w:pPr>
         <w:keepNext/>
-        <w:spacing w:after="80"/>
+        <w:spacing w:after="80" w:before="240"/>
         <w:jc w:val="center"/>
       </w:pPr>
       <w:r>
@@ -1588,7 +1588,7 @@
     <w:p>
       <w:pPr>
         <w:keepNext/>
-        <w:spacing w:after="80"/>
+        <w:spacing w:after="80" w:before="240"/>
         <w:jc w:val="center"/>
       </w:pPr>
       <w:r>
@@ -1649,7 +1649,7 @@
     <w:p>
       <w:pPr>
         <w:keepNext/>
-        <w:spacing w:after="80"/>
+        <w:spacing w:after="80" w:before="240"/>
         <w:jc w:val="center"/>
       </w:pPr>
       <w:r>
@@ -1690,7 +1690,7 @@
     <w:p>
       <w:pPr>
         <w:keepNext/>
-        <w:spacing w:after="80"/>
+        <w:spacing w:after="80" w:before="240"/>
         <w:jc w:val="center"/>
       </w:pPr>
       <w:r>
@@ -1756,7 +1756,7 @@
     <w:p>
       <w:pPr>
         <w:keepNext/>
-        <w:spacing w:after="80"/>
+        <w:spacing w:after="80" w:before="240"/>
         <w:jc w:val="center"/>
       </w:pPr>
       <w:r>
@@ -1819,7 +1819,7 @@
     <w:p>
       <w:pPr>
         <w:keepNext/>
-        <w:spacing w:after="80"/>
+        <w:spacing w:after="80" w:before="240"/>
         <w:jc w:val="center"/>
       </w:pPr>
       <w:r>
@@ -1888,7 +1888,7 @@
     <w:p>
       <w:pPr>
         <w:keepNext/>
-        <w:spacing w:after="80"/>
+        <w:spacing w:after="80" w:before="240"/>
         <w:jc w:val="center"/>
       </w:pPr>
       <w:r>
@@ -1957,7 +1957,7 @@
     <w:p>
       <w:pPr>
         <w:keepNext/>
-        <w:spacing w:after="80"/>
+        <w:spacing w:after="80" w:before="240"/>
         <w:jc w:val="center"/>
       </w:pPr>
       <w:r>
@@ -2114,7 +2114,7 @@
     <w:p>
       <w:pPr>
         <w:keepNext/>
-        <w:spacing w:after="80"/>
+        <w:spacing w:after="80" w:before="240"/>
         <w:jc w:val="center"/>
       </w:pPr>
       <w:r>
@@ -2169,7 +2169,7 @@
     <w:p>
       <w:pPr>
         <w:keepNext/>
-        <w:spacing w:after="80"/>
+        <w:spacing w:after="80" w:before="240"/>
         <w:jc w:val="center"/>
       </w:pPr>
       <w:r>
@@ -2230,7 +2230,7 @@
     <w:p>
       <w:pPr>
         <w:keepNext/>
-        <w:spacing w:after="80"/>
+        <w:spacing w:after="80" w:before="240"/>
         <w:jc w:val="center"/>
       </w:pPr>
       <w:r>
@@ -2305,7 +2305,7 @@
     <w:p>
       <w:pPr>
         <w:keepNext/>
-        <w:spacing w:after="80"/>
+        <w:spacing w:after="80" w:before="240"/>
         <w:jc w:val="center"/>
       </w:pPr>
       <w:r>
@@ -2392,7 +2392,7 @@
     <w:p>
       <w:pPr>
         <w:keepNext/>
-        <w:spacing w:after="80"/>
+        <w:spacing w:after="80" w:before="240"/>
         <w:jc w:val="center"/>
       </w:pPr>
       <w:r>
@@ -2443,7 +2443,7 @@
     <w:p>
       <w:pPr>
         <w:keepNext/>
-        <w:spacing w:after="80"/>
+        <w:spacing w:after="80" w:before="240"/>
         <w:jc w:val="center"/>
       </w:pPr>
       <w:r>
@@ -2498,7 +2498,7 @@
     <w:p>
       <w:pPr>
         <w:keepNext/>
-        <w:spacing w:after="80"/>
+        <w:spacing w:after="80" w:before="240"/>
         <w:jc w:val="center"/>
       </w:pPr>
       <w:r>
@@ -2563,7 +2563,7 @@
     <w:p>
       <w:pPr>
         <w:keepNext/>
-        <w:spacing w:after="80"/>
+        <w:spacing w:after="80" w:before="240"/>
         <w:jc w:val="center"/>
       </w:pPr>
       <w:r>
@@ -2624,7 +2624,7 @@
     <w:p>
       <w:pPr>
         <w:keepNext/>
-        <w:spacing w:after="80"/>
+        <w:spacing w:after="80" w:before="240"/>
         <w:jc w:val="center"/>
       </w:pPr>
       <w:r>
@@ -2679,7 +2679,7 @@
     <w:p>
       <w:pPr>
         <w:keepNext/>
-        <w:spacing w:after="80"/>
+        <w:spacing w:after="80" w:before="240"/>
         <w:jc w:val="center"/>
       </w:pPr>
       <w:r>
@@ -2768,7 +2768,7 @@
     <w:p>
       <w:pPr>
         <w:keepNext/>
-        <w:spacing w:after="80"/>
+        <w:spacing w:after="80" w:before="240"/>
         <w:jc w:val="center"/>
       </w:pPr>
       <w:r>
@@ -2809,7 +2809,7 @@
     <w:p>
       <w:pPr>
         <w:keepNext/>
-        <w:spacing w:after="80"/>
+        <w:spacing w:after="80" w:before="240"/>
         <w:jc w:val="center"/>
       </w:pPr>
       <w:r>
@@ -2850,7 +2850,7 @@
     <w:p>
       <w:pPr>
         <w:keepNext/>
-        <w:spacing w:after="80"/>
+        <w:spacing w:after="80" w:before="240"/>
         <w:jc w:val="center"/>
       </w:pPr>
       <w:r>
@@ -2891,7 +2891,7 @@
     <w:p>
       <w:pPr>
         <w:keepNext/>
-        <w:spacing w:after="80"/>
+        <w:spacing w:after="80" w:before="240"/>
         <w:jc w:val="center"/>
       </w:pPr>
       <w:r>
@@ -2960,7 +2960,7 @@
     <w:p>
       <w:pPr>
         <w:keepNext/>
-        <w:spacing w:after="80"/>
+        <w:spacing w:after="80" w:before="240"/>
         <w:jc w:val="center"/>
       </w:pPr>
       <w:r>
@@ -3021,7 +3021,7 @@
     <w:p>
       <w:pPr>
         <w:keepNext/>
-        <w:spacing w:after="80"/>
+        <w:spacing w:after="80" w:before="240"/>
         <w:jc w:val="center"/>
       </w:pPr>
       <w:r>
@@ -3084,7 +3084,7 @@
     <w:p>
       <w:pPr>
         <w:keepNext/>
-        <w:spacing w:after="80"/>
+        <w:spacing w:after="80" w:before="240"/>
         <w:jc w:val="center"/>
       </w:pPr>
       <w:r>
@@ -3139,7 +3139,7 @@
     <w:p>
       <w:pPr>
         <w:keepNext/>
-        <w:spacing w:after="80"/>
+        <w:spacing w:after="80" w:before="240"/>
         <w:jc w:val="center"/>
       </w:pPr>
       <w:r>
@@ -3313,7 +3313,7 @@
     <w:p>
       <w:pPr>
         <w:keepNext/>
-        <w:spacing w:after="80"/>
+        <w:spacing w:after="80" w:before="240"/>
         <w:jc w:val="center"/>
       </w:pPr>
       <w:r>
@@ -3368,7 +3368,7 @@
     <w:p>
       <w:pPr>
         <w:keepNext/>
-        <w:spacing w:after="80"/>
+        <w:spacing w:after="80" w:before="240"/>
         <w:jc w:val="center"/>
       </w:pPr>
       <w:r>
@@ -3429,7 +3429,7 @@
     <w:p>
       <w:pPr>
         <w:keepNext/>
-        <w:spacing w:after="80"/>
+        <w:spacing w:after="80" w:before="240"/>
         <w:jc w:val="center"/>
       </w:pPr>
       <w:r>
@@ -3484,7 +3484,7 @@
     <w:p>
       <w:pPr>
         <w:keepNext/>
-        <w:spacing w:after="80"/>
+        <w:spacing w:after="80" w:before="240"/>
         <w:jc w:val="center"/>
       </w:pPr>
       <w:r>
@@ -3726,7 +3726,7 @@
     <w:p>
       <w:pPr>
         <w:keepNext/>
-        <w:spacing w:after="80"/>
+        <w:spacing w:after="80" w:before="240"/>
         <w:jc w:val="center"/>
       </w:pPr>
       <w:r>
@@ -4191,7 +4191,7 @@
     <w:p>
       <w:pPr>
         <w:keepNext/>
-        <w:spacing w:after="80"/>
+        <w:spacing w:after="80" w:before="240"/>
         <w:jc w:val="center"/>
       </w:pPr>
       <w:r>
@@ -4400,7 +4400,7 @@
     <w:p>
       <w:pPr>
         <w:keepNext/>
-        <w:spacing w:after="80"/>
+        <w:spacing w:after="80" w:before="240"/>
         <w:jc w:val="center"/>
       </w:pPr>
       <w:r>
@@ -4666,7 +4666,7 @@
     <w:p>
       <w:pPr>
         <w:keepNext/>
-        <w:spacing w:after="80"/>
+        <w:spacing w:after="80" w:before="240"/>
         <w:jc w:val="center"/>
       </w:pPr>
       <w:r>
@@ -5267,7 +5267,7 @@
     <w:p>
       <w:pPr>
         <w:keepNext/>
-        <w:spacing w:after="80"/>
+        <w:spacing w:after="80" w:before="240"/>
         <w:jc w:val="center"/>
       </w:pPr>
       <w:r>

</xml_diff>